<commit_message>
Update Reflection manuals to latest versions
</commit_message>
<xml_diff>
--- a/Reflection - Administrator and Operations Manual v1.0.docx
+++ b/Reflection - Administrator and Operations Manual v1.0.docx
@@ -112,21 +112,21 @@
       <w:r>
         <w:rPr>
           <w:color w:val="5C6672"/>
-          <w:sz w:val="17"/>
+          <w:sz w:val="15"/>
           <w:caps w:val="1"/>
-          <w:spacing w:val="44"/>
+          <w:spacing w:val="18"/>
         </w:rPr>
-        <w:t xml:space="preserve">Client Handover Manual</w:t>
+        <w:t xml:space="preserve">Administrator &amp; Operations Manual</w:t>
       </w:r>
     </w:p>
     <w:p>
       <w:pPr>
-        <w:spacing w:before="0" w:after="1600" w:line="240" w:lineRule="auto"/>
+        <w:spacing w:before="0" w:after="1150" w:line="240" w:lineRule="auto"/>
       </w:pPr>
     </w:p>
     <w:p>
       <w:pPr>
-        <w:spacing w:before="0" w:after="0" w:line="240" w:lineRule="auto"/>
+        <w:spacing w:before="0" w:after="120" w:line="240" w:lineRule="auto"/>
         <w:jc w:val="center"/>
       </w:pPr>
       <w:r>
@@ -135,7 +135,7 @@
         </w:rPr>
         <w:drawing>
           <wp:inline distT="0" distB="0" distL="0" distR="0">
-            <wp:extent cx="3017520" cy="1430304"/>
+            <wp:extent cx="1188720" cy="1417320"/>
             <wp:effectExtent l="0" t="0" r="0" b="0"/>
             <wp:docPr id="1021" name="Reflection"/>
             <wp:cNvGraphicFramePr>
@@ -157,7 +157,7 @@
                   <pic:spPr>
                     <a:xfrm>
                       <a:off x="0" y="0"/>
-                      <a:ext cx="3017520" cy="1430304"/>
+                      <a:ext cx="1188720" cy="1417320"/>
                     </a:xfrm>
                     <a:prstGeom prst="rect">
                       <a:avLst/>
@@ -172,8 +172,38 @@
     </w:p>
     <w:p>
       <w:pPr>
+        <w:spacing w:before="0" w:after="0" w:line="240" w:lineRule="auto"/>
+        <w:jc w:val="center"/>
+      </w:pPr>
+      <w:r>
+        <w:rPr>
+          <w:b/>
+          <w:color w:val="0A2647"/>
+          <w:sz w:val="38"/>
+        </w:rPr>
+        <w:t xml:space="preserve">Reflecti</w:t>
+      </w:r>
+      <w:r>
+        <w:rPr>
+          <w:b/>
+          <w:color w:val="0E7C78"/>
+          <w:sz w:val="38"/>
+        </w:rPr>
+        <w:t xml:space="preserve">o</w:t>
+      </w:r>
+      <w:r>
+        <w:rPr>
+          <w:b/>
+          <w:color w:val="0A2647"/>
+          <w:sz w:val="38"/>
+        </w:rPr>
+        <w:t xml:space="preserve">n</w:t>
+      </w:r>
+    </w:p>
+    <w:p>
+      <w:pPr>
         <w:pStyle w:val="CoverRule"/>
-        <w:spacing w:before="340" w:after="320"/>
+        <w:spacing w:before="240" w:after="260"/>
       </w:pPr>
     </w:p>
     <w:p>
@@ -225,54 +255,8 @@
     </w:p>
     <w:p>
       <w:pPr>
-        <w:spacing w:before="0" w:after="1500" w:line="240" w:lineRule="auto"/>
+        <w:spacing w:before="0" w:after="800" w:line="240" w:lineRule="auto"/>
       </w:pPr>
-    </w:p>
-    <w:p>
-      <w:pPr>
-        <w:spacing w:before="0" w:after="200" w:line="240" w:lineRule="auto"/>
-        <w:jc w:val="center"/>
-      </w:pPr>
-      <w:r>
-        <w:rPr>
-          <w:noProof/>
-        </w:rPr>
-        <w:drawing>
-          <wp:inline distT="0" distB="0" distL="0" distR="0">
-            <wp:extent cx="446227" cy="530352"/>
-            <wp:effectExtent l="0" t="0" r="0" b="0"/>
-            <wp:docPr id="1023" name="Reflection bot"/>
-            <wp:cNvGraphicFramePr>
-              <a:graphicFrameLocks xmlns:a="http://schemas.openxmlformats.org/drawingml/2006/main" noChangeAspect="1"/>
-            </wp:cNvGraphicFramePr>
-            <a:graphic xmlns:a="http://schemas.openxmlformats.org/drawingml/2006/main">
-              <a:graphicData uri="http://schemas.openxmlformats.org/drawingml/2006/picture">
-                <pic:pic xmlns:pic="http://schemas.openxmlformats.org/drawingml/2006/picture">
-                  <pic:nvPicPr>
-                    <pic:cNvPr id="1024" name="Reflection bot"/>
-                    <pic:cNvPicPr/>
-                  </pic:nvPicPr>
-                  <pic:blipFill>
-                    <a:blip r:embed="rId104"/>
-                    <a:stretch>
-                      <a:fillRect/>
-                    </a:stretch>
-                  </pic:blipFill>
-                  <pic:spPr>
-                    <a:xfrm>
-                      <a:off x="0" y="0"/>
-                      <a:ext cx="446227" cy="530352"/>
-                    </a:xfrm>
-                    <a:prstGeom prst="rect">
-                      <a:avLst/>
-                    </a:prstGeom>
-                  </pic:spPr>
-                </pic:pic>
-              </a:graphicData>
-            </a:graphic>
-          </wp:inline>
-        </w:drawing>
-      </w:r>
     </w:p>
     <w:p>
       <w:pPr>
@@ -3657,10 +3641,7 @@
     </w:tbl>
     <w:p>
       <w:pPr>
-        <w:spacing w:before="0" w:after="60"/>
-        <w:rPr>
-          <w:sz w:val="12"/>
-        </w:rPr>
+        <w:spacing w:before="0" w:after="120" w:line="240" w:lineRule="auto"/>
       </w:pPr>
     </w:p>
     <w:p>
@@ -3892,10 +3873,7 @@
     </w:tbl>
     <w:p>
       <w:pPr>
-        <w:spacing w:before="0" w:after="60"/>
-        <w:rPr>
-          <w:sz w:val="12"/>
-        </w:rPr>
+        <w:spacing w:before="0" w:after="120" w:line="240" w:lineRule="auto"/>
       </w:pPr>
     </w:p>
     <w:p>
@@ -5411,7 +5389,7 @@
               <w:spacing w:before="20" w:after="20" w:line="252" w:lineRule="auto"/>
             </w:pPr>
             <w:r>
-              <w:t xml:space="preserve">Reflection Client Handover Manual</w:t>
+              <w:t xml:space="preserve">Reflection Administrator &amp; Operations Manual</w:t>
             </w:r>
           </w:p>
         </w:tc>
@@ -5566,21 +5544,18 @@
     </w:tbl>
     <w:p>
       <w:pPr>
-        <w:spacing w:before="0" w:after="60"/>
-        <w:rPr>
-          <w:sz w:val="12"/>
-        </w:rPr>
+        <w:spacing w:before="0" w:after="120" w:line="240" w:lineRule="auto"/>
       </w:pPr>
     </w:p>
     <w:p>
       <w:pPr>
         <w:pStyle w:val="CoverRule"/>
-        <w:spacing w:before="320" w:after="220"/>
+        <w:spacing w:before="160" w:after="160"/>
       </w:pPr>
     </w:p>
     <w:p>
       <w:pPr>
-        <w:spacing w:before="0" w:after="100" w:line="240" w:lineRule="auto"/>
+        <w:spacing w:before="0" w:after="80" w:line="240" w:lineRule="auto"/>
         <w:jc w:val="center"/>
       </w:pPr>
       <w:r>
@@ -5591,7 +5566,7 @@
           <wp:inline distT="0" distB="0" distL="0" distR="0">
             <wp:extent cx="658368" cy="340796"/>
             <wp:effectExtent l="0" t="0" r="0" b="0"/>
-            <wp:docPr id="1025" name="Tekmonks"/>
+            <wp:docPr id="1023" name="Tekmonks"/>
             <wp:cNvGraphicFramePr>
               <a:graphicFrameLocks xmlns:a="http://schemas.openxmlformats.org/drawingml/2006/main" noChangeAspect="1"/>
             </wp:cNvGraphicFramePr>
@@ -5599,11 +5574,11 @@
               <a:graphicData uri="http://schemas.openxmlformats.org/drawingml/2006/picture">
                 <pic:pic xmlns:pic="http://schemas.openxmlformats.org/drawingml/2006/picture">
                   <pic:nvPicPr>
-                    <pic:cNvPr id="1026" name="Tekmonks"/>
+                    <pic:cNvPr id="1024" name="Tekmonks"/>
                     <pic:cNvPicPr/>
                   </pic:nvPicPr>
                   <pic:blipFill>
-                    <a:blip r:embed="rId105"/>
+                    <a:blip r:embed="rId104"/>
                     <a:stretch>
                       <a:fillRect/>
                     </a:stretch>
@@ -5626,7 +5601,7 @@
     </w:p>
     <w:p>
       <w:pPr>
-        <w:spacing w:before="0" w:after="40" w:line="240" w:lineRule="auto"/>
+        <w:spacing w:before="0" w:after="0" w:line="240" w:lineRule="auto"/>
         <w:jc w:val="center"/>
       </w:pPr>
       <w:r>
@@ -5634,7 +5609,7 @@
           <w:color w:val="5C6672"/>
           <w:sz w:val="19"/>
         </w:rPr>
-        <w:t xml:space="preserve">Reflection · Client Handover Manual · Part II · Version 1.0</w:t>
+        <w:t xml:space="preserve">Reflection · Administrator &amp; Operations Manual · Part II · Version 1.0</w:t>
       </w:r>
     </w:p>
     <w:p>
@@ -5676,334 +5651,6 @@
 </w:ftr>
 </file>
 
-<file path=word/footer10.xml><?xml version="1.0" encoding="utf-8"?>
-<w:ftr xmlns:m="http://schemas.openxmlformats.org/officeDocument/2006/math" xmlns:mc="http://schemas.openxmlformats.org/markup-compatibility/2006" xmlns:mo="http://schemas.microsoft.com/office/mac/office/2008/main" xmlns:mv="urn:schemas-microsoft-com:mac:vml" xmlns:o="urn:schemas-microsoft-com:office:office" xmlns:r="http://schemas.openxmlformats.org/officeDocument/2006/relationships" xmlns:v="urn:schemas-microsoft-com:vml" xmlns:w10="urn:schemas-microsoft-com:office:word" xmlns:w14="http://schemas.microsoft.com/office/word/2010/wordml" xmlns:w="http://schemas.openxmlformats.org/wordprocessingml/2006/main" xmlns:wne="http://schemas.microsoft.com/office/word/2006/wordml" xmlns:wp14="http://schemas.microsoft.com/office/word/2010/wordprocessingDrawing" xmlns:wp="http://schemas.openxmlformats.org/drawingml/2006/wordprocessingDrawing" xmlns:wpc="http://schemas.microsoft.com/office/word/2010/wordprocessingCanvas" xmlns:wpg="http://schemas.microsoft.com/office/word/2010/wordprocessingGroup" xmlns:wpi="http://schemas.microsoft.com/office/word/2010/wordprocessingInk" xmlns:wps="http://schemas.microsoft.com/office/word/2010/wordprocessingShape" mc:Ignorable="w14 wp14">
-  <w:p>
-    <w:pPr>
-      <w:pBdr>
-        <w:top w:val="nil"/>
-        <w:bottom w:val="nil"/>
-      </w:pBdr>
-      <w:spacing w:after="0" w:before="0"/>
-    </w:pPr>
-  </w:p>
-</w:ftr>
-</file>
-
-<file path=word/footer11.xml><?xml version="1.0" encoding="utf-8"?>
-<w:ftr xmlns:m="http://schemas.openxmlformats.org/officeDocument/2006/math" xmlns:mc="http://schemas.openxmlformats.org/markup-compatibility/2006" xmlns:mo="http://schemas.microsoft.com/office/mac/office/2008/main" xmlns:mv="urn:schemas-microsoft-com:mac:vml" xmlns:o="urn:schemas-microsoft-com:office:office" xmlns:r="http://schemas.openxmlformats.org/officeDocument/2006/relationships" xmlns:v="urn:schemas-microsoft-com:vml" xmlns:w10="urn:schemas-microsoft-com:office:word" xmlns:w14="http://schemas.microsoft.com/office/word/2010/wordml" xmlns:w="http://schemas.openxmlformats.org/wordprocessingml/2006/main" xmlns:wne="http://schemas.microsoft.com/office/word/2006/wordml" xmlns:wp14="http://schemas.microsoft.com/office/word/2010/wordprocessingDrawing" xmlns:wp="http://schemas.openxmlformats.org/drawingml/2006/wordprocessingDrawing" xmlns:wpc="http://schemas.microsoft.com/office/word/2010/wordprocessingCanvas" xmlns:wpg="http://schemas.microsoft.com/office/word/2010/wordprocessingGroup" xmlns:wpi="http://schemas.microsoft.com/office/word/2010/wordprocessingInk" xmlns:wps="http://schemas.microsoft.com/office/word/2010/wordprocessingShape" mc:Ignorable="w14 wp14">
-  <w:p>
-    <w:pPr>
-      <w:pBdr>
-        <w:top w:val="nil"/>
-        <w:bottom w:val="nil"/>
-      </w:pBdr>
-      <w:spacing w:after="0" w:before="0"/>
-    </w:pPr>
-  </w:p>
-</w:ftr>
-</file>
-
-<file path=word/footer12.xml><?xml version="1.0" encoding="utf-8"?>
-<w:ftr xmlns:m="http://schemas.openxmlformats.org/officeDocument/2006/math" xmlns:mc="http://schemas.openxmlformats.org/markup-compatibility/2006" xmlns:mo="http://schemas.microsoft.com/office/mac/office/2008/main" xmlns:mv="urn:schemas-microsoft-com:mac:vml" xmlns:o="urn:schemas-microsoft-com:office:office" xmlns:r="http://schemas.openxmlformats.org/officeDocument/2006/relationships" xmlns:v="urn:schemas-microsoft-com:vml" xmlns:w10="urn:schemas-microsoft-com:office:word" xmlns:w14="http://schemas.microsoft.com/office/word/2010/wordml" xmlns:w="http://schemas.openxmlformats.org/wordprocessingml/2006/main" xmlns:wne="http://schemas.microsoft.com/office/word/2006/wordml" xmlns:wp14="http://schemas.microsoft.com/office/word/2010/wordprocessingDrawing" xmlns:wp="http://schemas.openxmlformats.org/drawingml/2006/wordprocessingDrawing" xmlns:wpc="http://schemas.microsoft.com/office/word/2010/wordprocessingCanvas" xmlns:wpg="http://schemas.microsoft.com/office/word/2010/wordprocessingGroup" xmlns:wpi="http://schemas.microsoft.com/office/word/2010/wordprocessingInk" xmlns:wps="http://schemas.microsoft.com/office/word/2010/wordprocessingShape" mc:Ignorable="w14 wp14">
-  <w:p>
-    <w:pPr>
-      <w:pStyle w:val="Footer"/>
-      <w:tabs>
-        <w:tab w:val="clear" w:pos="4513"/>
-        <w:tab w:val="clear" w:pos="4680"/>
-        <w:tab w:val="clear" w:pos="9026"/>
-        <w:tab w:val="clear" w:pos="9360"/>
-        <w:tab w:val="right" w:pos="9216"/>
-      </w:tabs>
-    </w:pPr>
-    <w:r>
-      <w:rPr>
-        <w:color w:val="5C6672"/>
-        <w:sz w:val="17"/>
-      </w:rPr>
-      <w:t>Reflection  |  Client Handover Manual</w:t>
-    </w:r>
-    <w:r>
-      <w:rPr>
-        <w:color w:val="5C6672"/>
-        <w:sz w:val="17"/>
-      </w:rPr>
-      <w:tab/>
-    </w:r>
-    <w:r>
-      <w:rPr>
-        <w:color w:val="5C6672"/>
-        <w:sz w:val="17"/>
-      </w:rPr>
-      <w:t xml:space="preserve">Page </w:t>
-    </w:r>
-    <w:r>
-      <w:rPr>
-        <w:color w:val="5C6672"/>
-        <w:sz w:val="17"/>
-      </w:rPr>
-      <w:fldChar w:fldCharType="begin"/>
-    </w:r>
-    <w:r>
-      <w:rPr>
-        <w:color w:val="5C6672"/>
-        <w:sz w:val="17"/>
-      </w:rPr>
-      <w:instrText xml:space="preserve"> PAGE </w:instrText>
-    </w:r>
-    <w:r>
-      <w:rPr>
-        <w:color w:val="5C6672"/>
-        <w:sz w:val="17"/>
-      </w:rPr>
-      <w:fldChar w:fldCharType="separate"/>
-    </w:r>
-    <w:r>
-      <w:rPr>
-        <w:color w:val="5C6672"/>
-        <w:sz w:val="17"/>
-      </w:rPr>
-      <w:t>1</w:t>
-    </w:r>
-    <w:r>
-      <w:rPr>
-        <w:color w:val="5C6672"/>
-        <w:sz w:val="17"/>
-      </w:rPr>
-      <w:fldChar w:fldCharType="end"/>
-    </w:r>
-    <w:r>
-      <w:rPr>
-        <w:color w:val="5C6672"/>
-        <w:sz w:val="17"/>
-      </w:rPr>
-      <w:t xml:space="preserve"> of </w:t>
-    </w:r>
-    <w:r>
-      <w:rPr>
-        <w:color w:val="5C6672"/>
-        <w:sz w:val="17"/>
-      </w:rPr>
-      <w:fldChar w:fldCharType="begin"/>
-    </w:r>
-    <w:r>
-      <w:rPr>
-        <w:color w:val="5C6672"/>
-        <w:sz w:val="17"/>
-      </w:rPr>
-      <w:instrText xml:space="preserve"> NUMPAGES </w:instrText>
-    </w:r>
-    <w:r>
-      <w:rPr>
-        <w:color w:val="5C6672"/>
-        <w:sz w:val="17"/>
-      </w:rPr>
-      <w:fldChar w:fldCharType="separate"/>
-    </w:r>
-    <w:r>
-      <w:rPr>
-        <w:color w:val="5C6672"/>
-        <w:sz w:val="17"/>
-      </w:rPr>
-      <w:t>1</w:t>
-    </w:r>
-    <w:r>
-      <w:rPr>
-        <w:color w:val="5C6672"/>
-        <w:sz w:val="17"/>
-      </w:rPr>
-      <w:fldChar w:fldCharType="end"/>
-    </w:r>
-  </w:p>
-</w:ftr>
-</file>
-
-<file path=word/footer2.xml><?xml version="1.0" encoding="utf-8"?>
-<w:ftr xmlns:m="http://schemas.openxmlformats.org/officeDocument/2006/math" xmlns:mc="http://schemas.openxmlformats.org/markup-compatibility/2006" xmlns:mo="http://schemas.microsoft.com/office/mac/office/2008/main" xmlns:mv="urn:schemas-microsoft-com:mac:vml" xmlns:o="urn:schemas-microsoft-com:office:office" xmlns:r="http://schemas.openxmlformats.org/officeDocument/2006/relationships" xmlns:v="urn:schemas-microsoft-com:vml" xmlns:w10="urn:schemas-microsoft-com:office:word" xmlns:w14="http://schemas.microsoft.com/office/word/2010/wordml" xmlns:w="http://schemas.openxmlformats.org/wordprocessingml/2006/main" xmlns:wne="http://schemas.microsoft.com/office/word/2006/wordml" xmlns:wp14="http://schemas.microsoft.com/office/word/2010/wordprocessingDrawing" xmlns:wp="http://schemas.openxmlformats.org/drawingml/2006/wordprocessingDrawing" xmlns:wpc="http://schemas.microsoft.com/office/word/2010/wordprocessingCanvas" xmlns:wpg="http://schemas.microsoft.com/office/word/2010/wordprocessingGroup" xmlns:wpi="http://schemas.microsoft.com/office/word/2010/wordprocessingInk" xmlns:wps="http://schemas.microsoft.com/office/word/2010/wordprocessingShape" mc:Ignorable="w14 wp14">
-  <w:p>
-    <w:pPr>
-      <w:pBdr>
-        <w:top w:val="nil"/>
-        <w:bottom w:val="nil"/>
-      </w:pBdr>
-      <w:spacing w:after="0" w:before="0"/>
-    </w:pPr>
-  </w:p>
-</w:ftr>
-</file>
-
-<file path=word/footer3.xml><?xml version="1.0" encoding="utf-8"?>
-<w:ftr xmlns:m="http://schemas.openxmlformats.org/officeDocument/2006/math" xmlns:mc="http://schemas.openxmlformats.org/markup-compatibility/2006" xmlns:mo="http://schemas.microsoft.com/office/mac/office/2008/main" xmlns:mv="urn:schemas-microsoft-com:mac:vml" xmlns:o="urn:schemas-microsoft-com:office:office" xmlns:r="http://schemas.openxmlformats.org/officeDocument/2006/relationships" xmlns:v="urn:schemas-microsoft-com:vml" xmlns:w10="urn:schemas-microsoft-com:office:word" xmlns:w14="http://schemas.microsoft.com/office/word/2010/wordml" xmlns:w="http://schemas.openxmlformats.org/wordprocessingml/2006/main" xmlns:wne="http://schemas.microsoft.com/office/word/2006/wordml" xmlns:wp14="http://schemas.microsoft.com/office/word/2010/wordprocessingDrawing" xmlns:wp="http://schemas.openxmlformats.org/drawingml/2006/wordprocessingDrawing" xmlns:wpc="http://schemas.microsoft.com/office/word/2010/wordprocessingCanvas" xmlns:wpg="http://schemas.microsoft.com/office/word/2010/wordprocessingGroup" xmlns:wpi="http://schemas.microsoft.com/office/word/2010/wordprocessingInk" xmlns:wps="http://schemas.microsoft.com/office/word/2010/wordprocessingShape" mc:Ignorable="w14 wp14">
-  <w:p>
-    <w:pPr>
-      <w:pBdr>
-        <w:top w:val="nil"/>
-        <w:bottom w:val="nil"/>
-      </w:pBdr>
-      <w:spacing w:after="0" w:before="0"/>
-    </w:pPr>
-  </w:p>
-</w:ftr>
-</file>
-
-<file path=word/footer4.xml><?xml version="1.0" encoding="utf-8"?>
-<w:ftr xmlns:m="http://schemas.openxmlformats.org/officeDocument/2006/math" xmlns:mc="http://schemas.openxmlformats.org/markup-compatibility/2006" xmlns:mo="http://schemas.microsoft.com/office/mac/office/2008/main" xmlns:mv="urn:schemas-microsoft-com:mac:vml" xmlns:o="urn:schemas-microsoft-com:office:office" xmlns:r="http://schemas.openxmlformats.org/officeDocument/2006/relationships" xmlns:v="urn:schemas-microsoft-com:vml" xmlns:w10="urn:schemas-microsoft-com:office:word" xmlns:w14="http://schemas.microsoft.com/office/word/2010/wordml" xmlns:w="http://schemas.openxmlformats.org/wordprocessingml/2006/main" xmlns:wne="http://schemas.microsoft.com/office/word/2006/wordml" xmlns:wp14="http://schemas.microsoft.com/office/word/2010/wordprocessingDrawing" xmlns:wp="http://schemas.openxmlformats.org/drawingml/2006/wordprocessingDrawing" xmlns:wpc="http://schemas.microsoft.com/office/word/2010/wordprocessingCanvas" xmlns:wpg="http://schemas.microsoft.com/office/word/2010/wordprocessingGroup" xmlns:wpi="http://schemas.microsoft.com/office/word/2010/wordprocessingInk" xmlns:wps="http://schemas.microsoft.com/office/word/2010/wordprocessingShape" mc:Ignorable="w14 wp14">
-  <w:p>
-    <w:pPr>
-      <w:pStyle w:val="Footer"/>
-      <w:tabs>
-        <w:tab w:val="clear" w:pos="4513"/>
-        <w:tab w:val="clear" w:pos="4680"/>
-        <w:tab w:val="clear" w:pos="9026"/>
-        <w:tab w:val="clear" w:pos="9360"/>
-        <w:tab w:val="right" w:pos="9216"/>
-      </w:tabs>
-    </w:pPr>
-    <w:r>
-      <w:rPr>
-        <w:color w:val="5C6672"/>
-        <w:sz w:val="17"/>
-      </w:rPr>
-      <w:t>Reflection  |  Client Handover Manual</w:t>
-    </w:r>
-    <w:r>
-      <w:rPr>
-        <w:color w:val="5C6672"/>
-        <w:sz w:val="17"/>
-      </w:rPr>
-      <w:tab/>
-    </w:r>
-    <w:r>
-      <w:rPr>
-        <w:color w:val="5C6672"/>
-        <w:sz w:val="17"/>
-      </w:rPr>
-      <w:t xml:space="preserve">Page </w:t>
-    </w:r>
-    <w:r>
-      <w:rPr>
-        <w:color w:val="5C6672"/>
-        <w:sz w:val="17"/>
-      </w:rPr>
-      <w:fldChar w:fldCharType="begin"/>
-    </w:r>
-    <w:r>
-      <w:rPr>
-        <w:color w:val="5C6672"/>
-        <w:sz w:val="17"/>
-      </w:rPr>
-      <w:instrText xml:space="preserve"> PAGE </w:instrText>
-    </w:r>
-    <w:r>
-      <w:rPr>
-        <w:color w:val="5C6672"/>
-        <w:sz w:val="17"/>
-      </w:rPr>
-      <w:fldChar w:fldCharType="separate"/>
-    </w:r>
-    <w:r>
-      <w:rPr>
-        <w:color w:val="5C6672"/>
-        <w:sz w:val="17"/>
-      </w:rPr>
-      <w:t>1</w:t>
-    </w:r>
-    <w:r>
-      <w:rPr>
-        <w:color w:val="5C6672"/>
-        <w:sz w:val="17"/>
-      </w:rPr>
-      <w:fldChar w:fldCharType="end"/>
-    </w:r>
-    <w:r>
-      <w:rPr>
-        <w:color w:val="5C6672"/>
-        <w:sz w:val="17"/>
-      </w:rPr>
-      <w:t xml:space="preserve"> of </w:t>
-    </w:r>
-    <w:r>
-      <w:rPr>
-        <w:color w:val="5C6672"/>
-        <w:sz w:val="17"/>
-      </w:rPr>
-      <w:fldChar w:fldCharType="begin"/>
-    </w:r>
-    <w:r>
-      <w:rPr>
-        <w:color w:val="5C6672"/>
-        <w:sz w:val="17"/>
-      </w:rPr>
-      <w:instrText xml:space="preserve"> NUMPAGES </w:instrText>
-    </w:r>
-    <w:r>
-      <w:rPr>
-        <w:color w:val="5C6672"/>
-        <w:sz w:val="17"/>
-      </w:rPr>
-      <w:fldChar w:fldCharType="separate"/>
-    </w:r>
-    <w:r>
-      <w:rPr>
-        <w:color w:val="5C6672"/>
-        <w:sz w:val="17"/>
-      </w:rPr>
-      <w:t>1</w:t>
-    </w:r>
-    <w:r>
-      <w:rPr>
-        <w:color w:val="5C6672"/>
-        <w:sz w:val="17"/>
-      </w:rPr>
-      <w:fldChar w:fldCharType="end"/>
-    </w:r>
-  </w:p>
-</w:ftr>
-</file>
-
-<file path=word/footer5.xml><?xml version="1.0" encoding="utf-8"?>
-<w:ftr xmlns:m="http://schemas.openxmlformats.org/officeDocument/2006/math" xmlns:mc="http://schemas.openxmlformats.org/markup-compatibility/2006" xmlns:mo="http://schemas.microsoft.com/office/mac/office/2008/main" xmlns:mv="urn:schemas-microsoft-com:mac:vml" xmlns:o="urn:schemas-microsoft-com:office:office" xmlns:r="http://schemas.openxmlformats.org/officeDocument/2006/relationships" xmlns:v="urn:schemas-microsoft-com:vml" xmlns:w10="urn:schemas-microsoft-com:office:word" xmlns:w14="http://schemas.microsoft.com/office/word/2010/wordml" xmlns:w="http://schemas.openxmlformats.org/wordprocessingml/2006/main" xmlns:wne="http://schemas.microsoft.com/office/word/2006/wordml" xmlns:wp14="http://schemas.microsoft.com/office/word/2010/wordprocessingDrawing" xmlns:wp="http://schemas.openxmlformats.org/drawingml/2006/wordprocessingDrawing" xmlns:wpc="http://schemas.microsoft.com/office/word/2010/wordprocessingCanvas" xmlns:wpg="http://schemas.microsoft.com/office/word/2010/wordprocessingGroup" xmlns:wpi="http://schemas.microsoft.com/office/word/2010/wordprocessingInk" xmlns:wps="http://schemas.microsoft.com/office/word/2010/wordprocessingShape" mc:Ignorable="w14 wp14">
-  <w:p>
-    <w:pPr>
-      <w:pBdr>
-        <w:top w:val="nil"/>
-        <w:bottom w:val="nil"/>
-      </w:pBdr>
-      <w:spacing w:after="0" w:before="0"/>
-    </w:pPr>
-  </w:p>
-</w:ftr>
-</file>
-
-<file path=word/footer6.xml><?xml version="1.0" encoding="utf-8"?>
-<w:ftr xmlns:m="http://schemas.openxmlformats.org/officeDocument/2006/math" xmlns:mc="http://schemas.openxmlformats.org/markup-compatibility/2006" xmlns:mo="http://schemas.microsoft.com/office/mac/office/2008/main" xmlns:mv="urn:schemas-microsoft-com:mac:vml" xmlns:o="urn:schemas-microsoft-com:office:office" xmlns:r="http://schemas.openxmlformats.org/officeDocument/2006/relationships" xmlns:v="urn:schemas-microsoft-com:vml" xmlns:w10="urn:schemas-microsoft-com:office:word" xmlns:w14="http://schemas.microsoft.com/office/word/2010/wordml" xmlns:w="http://schemas.openxmlformats.org/wordprocessingml/2006/main" xmlns:wne="http://schemas.microsoft.com/office/word/2006/wordml" xmlns:wp14="http://schemas.microsoft.com/office/word/2010/wordprocessingDrawing" xmlns:wp="http://schemas.openxmlformats.org/drawingml/2006/wordprocessingDrawing" xmlns:wpc="http://schemas.microsoft.com/office/word/2010/wordprocessingCanvas" xmlns:wpg="http://schemas.microsoft.com/office/word/2010/wordprocessingGroup" xmlns:wpi="http://schemas.microsoft.com/office/word/2010/wordprocessingInk" xmlns:wps="http://schemas.microsoft.com/office/word/2010/wordprocessingShape" mc:Ignorable="w14 wp14">
-  <w:p>
-    <w:pPr>
-      <w:pBdr>
-        <w:top w:val="nil"/>
-        <w:bottom w:val="nil"/>
-      </w:pBdr>
-      <w:spacing w:after="0" w:before="0"/>
-    </w:pPr>
-  </w:p>
-</w:ftr>
-</file>
-
-<file path=word/footer7.xml><?xml version="1.0" encoding="utf-8"?>
-<w:ftr xmlns:m="http://schemas.openxmlformats.org/officeDocument/2006/math" xmlns:mc="http://schemas.openxmlformats.org/markup-compatibility/2006" xmlns:mo="http://schemas.microsoft.com/office/mac/office/2008/main" xmlns:mv="urn:schemas-microsoft-com:mac:vml" xmlns:o="urn:schemas-microsoft-com:office:office" xmlns:r="http://schemas.openxmlformats.org/officeDocument/2006/relationships" xmlns:v="urn:schemas-microsoft-com:vml" xmlns:w10="urn:schemas-microsoft-com:office:word" xmlns:w14="http://schemas.microsoft.com/office/word/2010/wordml" xmlns:w="http://schemas.openxmlformats.org/wordprocessingml/2006/main" xmlns:wne="http://schemas.microsoft.com/office/word/2006/wordml" xmlns:wp14="http://schemas.microsoft.com/office/word/2010/wordprocessingDrawing" xmlns:wp="http://schemas.openxmlformats.org/drawingml/2006/wordprocessingDrawing" xmlns:wpc="http://schemas.microsoft.com/office/word/2010/wordprocessingCanvas" xmlns:wpg="http://schemas.microsoft.com/office/word/2010/wordprocessingGroup" xmlns:wpi="http://schemas.microsoft.com/office/word/2010/wordprocessingInk" xmlns:wps="http://schemas.microsoft.com/office/word/2010/wordprocessingShape" mc:Ignorable="w14 wp14">
-  <w:p>
-    <w:pPr>
-      <w:pBdr>
-        <w:top w:val="nil"/>
-        <w:bottom w:val="nil"/>
-      </w:pBdr>
-      <w:spacing w:after="0" w:before="0"/>
-    </w:pPr>
-  </w:p>
-</w:ftr>
-</file>
-
 <file path=word/footer8.xml><?xml version="1.0" encoding="utf-8"?>
 <w:ftr xmlns:m="http://schemas.openxmlformats.org/officeDocument/2006/math" xmlns:mc="http://schemas.openxmlformats.org/markup-compatibility/2006" xmlns:mo="http://schemas.microsoft.com/office/mac/office/2008/main" xmlns:mv="urn:schemas-microsoft-com:mac:vml" xmlns:o="urn:schemas-microsoft-com:office:office" xmlns:r="http://schemas.openxmlformats.org/officeDocument/2006/relationships" xmlns:v="urn:schemas-microsoft-com:vml" xmlns:w10="urn:schemas-microsoft-com:office:word" xmlns:w14="http://schemas.microsoft.com/office/word/2010/wordml" xmlns:w="http://schemas.openxmlformats.org/wordprocessingml/2006/main" xmlns:wne="http://schemas.microsoft.com/office/word/2006/wordml" xmlns:wp14="http://schemas.microsoft.com/office/word/2010/wordprocessingDrawing" xmlns:wp="http://schemas.openxmlformats.org/drawingml/2006/wordprocessingDrawing" xmlns:wpc="http://schemas.microsoft.com/office/word/2010/wordprocessingCanvas" xmlns:wpg="http://schemas.microsoft.com/office/word/2010/wordprocessingGroup" xmlns:wpi="http://schemas.microsoft.com/office/word/2010/wordprocessingInk" xmlns:wps="http://schemas.microsoft.com/office/word/2010/wordprocessingShape" mc:Ignorable="w14 wp14">
   <w:p>
@@ -6119,191 +5766,7 @@
 </w:ftr>
 </file>
 
-<file path=word/footer9.xml><?xml version="1.0" encoding="utf-8"?>
-<w:ftr xmlns:m="http://schemas.openxmlformats.org/officeDocument/2006/math" xmlns:mc="http://schemas.openxmlformats.org/markup-compatibility/2006" xmlns:mo="http://schemas.microsoft.com/office/mac/office/2008/main" xmlns:mv="urn:schemas-microsoft-com:mac:vml" xmlns:o="urn:schemas-microsoft-com:office:office" xmlns:r="http://schemas.openxmlformats.org/officeDocument/2006/relationships" xmlns:v="urn:schemas-microsoft-com:vml" xmlns:w10="urn:schemas-microsoft-com:office:word" xmlns:w14="http://schemas.microsoft.com/office/word/2010/wordml" xmlns:w="http://schemas.openxmlformats.org/wordprocessingml/2006/main" xmlns:wne="http://schemas.microsoft.com/office/word/2006/wordml" xmlns:wp14="http://schemas.microsoft.com/office/word/2010/wordprocessingDrawing" xmlns:wp="http://schemas.openxmlformats.org/drawingml/2006/wordprocessingDrawing" xmlns:wpc="http://schemas.microsoft.com/office/word/2010/wordprocessingCanvas" xmlns:wpg="http://schemas.microsoft.com/office/word/2010/wordprocessingGroup" xmlns:wpi="http://schemas.microsoft.com/office/word/2010/wordprocessingInk" xmlns:wps="http://schemas.microsoft.com/office/word/2010/wordprocessingShape" mc:Ignorable="w14 wp14">
-  <w:p>
-    <w:pPr>
-      <w:pBdr>
-        <w:top w:val="nil"/>
-        <w:bottom w:val="nil"/>
-      </w:pBdr>
-      <w:spacing w:after="0" w:before="0"/>
-    </w:pPr>
-  </w:p>
-</w:ftr>
-</file>
-
 <file path=word/header1.xml><?xml version="1.0" encoding="utf-8"?>
-<w:hdr xmlns:m="http://schemas.openxmlformats.org/officeDocument/2006/math" xmlns:mc="http://schemas.openxmlformats.org/markup-compatibility/2006" xmlns:mo="http://schemas.microsoft.com/office/mac/office/2008/main" xmlns:mv="urn:schemas-microsoft-com:mac:vml" xmlns:o="urn:schemas-microsoft-com:office:office" xmlns:r="http://schemas.openxmlformats.org/officeDocument/2006/relationships" xmlns:v="urn:schemas-microsoft-com:vml" xmlns:w10="urn:schemas-microsoft-com:office:word" xmlns:w14="http://schemas.microsoft.com/office/word/2010/wordml" xmlns:w="http://schemas.openxmlformats.org/wordprocessingml/2006/main" xmlns:wne="http://schemas.microsoft.com/office/word/2006/wordml" xmlns:wp14="http://schemas.microsoft.com/office/word/2010/wordprocessingDrawing" xmlns:wp="http://schemas.openxmlformats.org/drawingml/2006/wordprocessingDrawing" xmlns:wpc="http://schemas.microsoft.com/office/word/2010/wordprocessingCanvas" xmlns:wpg="http://schemas.microsoft.com/office/word/2010/wordprocessingGroup" xmlns:wpi="http://schemas.microsoft.com/office/word/2010/wordprocessingInk" xmlns:wps="http://schemas.microsoft.com/office/word/2010/wordprocessingShape" mc:Ignorable="w14 wp14">
-  <w:p>
-    <w:pPr>
-      <w:pBdr>
-        <w:top w:val="nil"/>
-        <w:bottom w:val="nil"/>
-      </w:pBdr>
-      <w:spacing w:after="0" w:before="0"/>
-    </w:pPr>
-  </w:p>
-</w:hdr>
-</file>
-
-<file path=word/header10.xml><?xml version="1.0" encoding="utf-8"?>
-<w:hdr xmlns:m="http://schemas.openxmlformats.org/officeDocument/2006/math" xmlns:mc="http://schemas.openxmlformats.org/markup-compatibility/2006" xmlns:mo="http://schemas.microsoft.com/office/mac/office/2008/main" xmlns:mv="urn:schemas-microsoft-com:mac:vml" xmlns:o="urn:schemas-microsoft-com:office:office" xmlns:r="http://schemas.openxmlformats.org/officeDocument/2006/relationships" xmlns:v="urn:schemas-microsoft-com:vml" xmlns:w10="urn:schemas-microsoft-com:office:word" xmlns:w14="http://schemas.microsoft.com/office/word/2010/wordml" xmlns:w="http://schemas.openxmlformats.org/wordprocessingml/2006/main" xmlns:wne="http://schemas.microsoft.com/office/word/2006/wordml" xmlns:wp14="http://schemas.microsoft.com/office/word/2010/wordprocessingDrawing" xmlns:wp="http://schemas.openxmlformats.org/drawingml/2006/wordprocessingDrawing" xmlns:wpc="http://schemas.microsoft.com/office/word/2010/wordprocessingCanvas" xmlns:wpg="http://schemas.microsoft.com/office/word/2010/wordprocessingGroup" xmlns:wpi="http://schemas.microsoft.com/office/word/2010/wordprocessingInk" xmlns:wps="http://schemas.microsoft.com/office/word/2010/wordprocessingShape" mc:Ignorable="w14 wp14">
-  <w:p>
-    <w:pPr>
-      <w:pBdr>
-        <w:top w:val="nil"/>
-        <w:bottom w:val="nil"/>
-      </w:pBdr>
-      <w:spacing w:after="0" w:before="0"/>
-    </w:pPr>
-  </w:p>
-</w:hdr>
-</file>
-
-<file path=word/header11.xml><?xml version="1.0" encoding="utf-8"?>
-<w:hdr xmlns:m="http://schemas.openxmlformats.org/officeDocument/2006/math" xmlns:mc="http://schemas.openxmlformats.org/markup-compatibility/2006" xmlns:mo="http://schemas.microsoft.com/office/mac/office/2008/main" xmlns:mv="urn:schemas-microsoft-com:mac:vml" xmlns:o="urn:schemas-microsoft-com:office:office" xmlns:r="http://schemas.openxmlformats.org/officeDocument/2006/relationships" xmlns:v="urn:schemas-microsoft-com:vml" xmlns:w10="urn:schemas-microsoft-com:office:word" xmlns:w14="http://schemas.microsoft.com/office/word/2010/wordml" xmlns:w="http://schemas.openxmlformats.org/wordprocessingml/2006/main" xmlns:wne="http://schemas.microsoft.com/office/word/2006/wordml" xmlns:wp14="http://schemas.microsoft.com/office/word/2010/wordprocessingDrawing" xmlns:wp="http://schemas.openxmlformats.org/drawingml/2006/wordprocessingDrawing" xmlns:wpc="http://schemas.microsoft.com/office/word/2010/wordprocessingCanvas" xmlns:wpg="http://schemas.microsoft.com/office/word/2010/wordprocessingGroup" xmlns:wpi="http://schemas.microsoft.com/office/word/2010/wordprocessingInk" xmlns:wps="http://schemas.microsoft.com/office/word/2010/wordprocessingShape" mc:Ignorable="w14 wp14">
-  <w:p>
-    <w:pPr>
-      <w:pBdr>
-        <w:top w:val="nil"/>
-        <w:bottom w:val="nil"/>
-      </w:pBdr>
-      <w:spacing w:after="0" w:before="0"/>
-    </w:pPr>
-  </w:p>
-</w:hdr>
-</file>
-
-<file path=word/header12.xml><?xml version="1.0" encoding="utf-8"?>
-<w:hdr xmlns:m="http://schemas.openxmlformats.org/officeDocument/2006/math" xmlns:mc="http://schemas.openxmlformats.org/markup-compatibility/2006" xmlns:mo="http://schemas.microsoft.com/office/mac/office/2008/main" xmlns:mv="urn:schemas-microsoft-com:mac:vml" xmlns:o="urn:schemas-microsoft-com:office:office" xmlns:r="http://schemas.openxmlformats.org/officeDocument/2006/relationships" xmlns:v="urn:schemas-microsoft-com:vml" xmlns:w10="urn:schemas-microsoft-com:office:word" xmlns:w14="http://schemas.microsoft.com/office/word/2010/wordml" xmlns:w="http://schemas.openxmlformats.org/wordprocessingml/2006/main" xmlns:wne="http://schemas.microsoft.com/office/word/2006/wordml" xmlns:wp14="http://schemas.microsoft.com/office/word/2010/wordprocessingDrawing" xmlns:wp="http://schemas.openxmlformats.org/drawingml/2006/wordprocessingDrawing" xmlns:wpc="http://schemas.microsoft.com/office/word/2010/wordprocessingCanvas" xmlns:wpg="http://schemas.microsoft.com/office/word/2010/wordprocessingGroup" xmlns:wpi="http://schemas.microsoft.com/office/word/2010/wordprocessingInk" xmlns:wps="http://schemas.microsoft.com/office/word/2010/wordprocessingShape" mc:Ignorable="w14 wp14">
-  <w:p>
-    <w:pPr>
-      <w:pStyle w:val="Header"/>
-      <w:tabs>
-        <w:tab w:val="clear" w:pos="4513"/>
-        <w:tab w:val="clear" w:pos="4680"/>
-        <w:tab w:val="clear" w:pos="9026"/>
-        <w:tab w:val="clear" w:pos="9360"/>
-        <w:tab w:val="right" w:pos="9216"/>
-      </w:tabs>
-    </w:pPr>
-    <w:r>
-      <w:rPr>
-        <w:b/>
-        <w:color w:val="0A2647"/>
-        <w:sz w:val="17"/>
-        <w:spacing w:val="34"/>
-      </w:rPr>
-      <w:t>REFLECTION</w:t>
-    </w:r>
-    <w:r>
-      <w:tab/>
-    </w:r>
-    <w:r>
-      <w:rPr>
-        <w:color w:val="5C6672"/>
-        <w:sz w:val="17"/>
-      </w:rPr>
-      <w:t>Part II  ·  Administrator &amp; Operations Manual</w:t>
-    </w:r>
-  </w:p>
-</w:hdr>
-</file>
-
-<file path=word/header2.xml><?xml version="1.0" encoding="utf-8"?>
-<w:hdr xmlns:m="http://schemas.openxmlformats.org/officeDocument/2006/math" xmlns:mc="http://schemas.openxmlformats.org/markup-compatibility/2006" xmlns:mo="http://schemas.microsoft.com/office/mac/office/2008/main" xmlns:mv="urn:schemas-microsoft-com:mac:vml" xmlns:o="urn:schemas-microsoft-com:office:office" xmlns:r="http://schemas.openxmlformats.org/officeDocument/2006/relationships" xmlns:v="urn:schemas-microsoft-com:vml" xmlns:w10="urn:schemas-microsoft-com:office:word" xmlns:w14="http://schemas.microsoft.com/office/word/2010/wordml" xmlns:w="http://schemas.openxmlformats.org/wordprocessingml/2006/main" xmlns:wne="http://schemas.microsoft.com/office/word/2006/wordml" xmlns:wp14="http://schemas.microsoft.com/office/word/2010/wordprocessingDrawing" xmlns:wp="http://schemas.openxmlformats.org/drawingml/2006/wordprocessingDrawing" xmlns:wpc="http://schemas.microsoft.com/office/word/2010/wordprocessingCanvas" xmlns:wpg="http://schemas.microsoft.com/office/word/2010/wordprocessingGroup" xmlns:wpi="http://schemas.microsoft.com/office/word/2010/wordprocessingInk" xmlns:wps="http://schemas.microsoft.com/office/word/2010/wordprocessingShape" mc:Ignorable="w14 wp14">
-  <w:p>
-    <w:pPr>
-      <w:pBdr>
-        <w:top w:val="nil"/>
-        <w:bottom w:val="nil"/>
-      </w:pBdr>
-      <w:spacing w:after="0" w:before="0"/>
-    </w:pPr>
-  </w:p>
-</w:hdr>
-</file>
-
-<file path=word/header3.xml><?xml version="1.0" encoding="utf-8"?>
-<w:hdr xmlns:m="http://schemas.openxmlformats.org/officeDocument/2006/math" xmlns:mc="http://schemas.openxmlformats.org/markup-compatibility/2006" xmlns:mo="http://schemas.microsoft.com/office/mac/office/2008/main" xmlns:mv="urn:schemas-microsoft-com:mac:vml" xmlns:o="urn:schemas-microsoft-com:office:office" xmlns:r="http://schemas.openxmlformats.org/officeDocument/2006/relationships" xmlns:v="urn:schemas-microsoft-com:vml" xmlns:w10="urn:schemas-microsoft-com:office:word" xmlns:w14="http://schemas.microsoft.com/office/word/2010/wordml" xmlns:w="http://schemas.openxmlformats.org/wordprocessingml/2006/main" xmlns:wne="http://schemas.microsoft.com/office/word/2006/wordml" xmlns:wp14="http://schemas.microsoft.com/office/word/2010/wordprocessingDrawing" xmlns:wp="http://schemas.openxmlformats.org/drawingml/2006/wordprocessingDrawing" xmlns:wpc="http://schemas.microsoft.com/office/word/2010/wordprocessingCanvas" xmlns:wpg="http://schemas.microsoft.com/office/word/2010/wordprocessingGroup" xmlns:wpi="http://schemas.microsoft.com/office/word/2010/wordprocessingInk" xmlns:wps="http://schemas.microsoft.com/office/word/2010/wordprocessingShape" mc:Ignorable="w14 wp14">
-  <w:p>
-    <w:pPr>
-      <w:pBdr>
-        <w:top w:val="nil"/>
-        <w:bottom w:val="nil"/>
-      </w:pBdr>
-      <w:spacing w:after="0" w:before="0"/>
-    </w:pPr>
-  </w:p>
-</w:hdr>
-</file>
-
-<file path=word/header4.xml><?xml version="1.0" encoding="utf-8"?>
-<w:hdr xmlns:m="http://schemas.openxmlformats.org/officeDocument/2006/math" xmlns:mc="http://schemas.openxmlformats.org/markup-compatibility/2006" xmlns:mo="http://schemas.microsoft.com/office/mac/office/2008/main" xmlns:mv="urn:schemas-microsoft-com:mac:vml" xmlns:o="urn:schemas-microsoft-com:office:office" xmlns:r="http://schemas.openxmlformats.org/officeDocument/2006/relationships" xmlns:v="urn:schemas-microsoft-com:vml" xmlns:w10="urn:schemas-microsoft-com:office:word" xmlns:w14="http://schemas.microsoft.com/office/word/2010/wordml" xmlns:w="http://schemas.openxmlformats.org/wordprocessingml/2006/main" xmlns:wne="http://schemas.microsoft.com/office/word/2006/wordml" xmlns:wp14="http://schemas.microsoft.com/office/word/2010/wordprocessingDrawing" xmlns:wp="http://schemas.openxmlformats.org/drawingml/2006/wordprocessingDrawing" xmlns:wpc="http://schemas.microsoft.com/office/word/2010/wordprocessingCanvas" xmlns:wpg="http://schemas.microsoft.com/office/word/2010/wordprocessingGroup" xmlns:wpi="http://schemas.microsoft.com/office/word/2010/wordprocessingInk" xmlns:wps="http://schemas.microsoft.com/office/word/2010/wordprocessingShape" mc:Ignorable="w14 wp14">
-  <w:p>
-    <w:pPr>
-      <w:pStyle w:val="Header"/>
-      <w:tabs>
-        <w:tab w:val="clear" w:pos="4513"/>
-        <w:tab w:val="clear" w:pos="4680"/>
-        <w:tab w:val="clear" w:pos="9026"/>
-        <w:tab w:val="clear" w:pos="9360"/>
-        <w:tab w:val="right" w:pos="9216"/>
-      </w:tabs>
-    </w:pPr>
-    <w:r>
-      <w:rPr>
-        <w:b/>
-        <w:color w:val="0A2647"/>
-        <w:sz w:val="17"/>
-        <w:spacing w:val="34"/>
-      </w:rPr>
-      <w:t>REFLECTION</w:t>
-    </w:r>
-    <w:r>
-      <w:tab/>
-    </w:r>
-    <w:r>
-      <w:rPr>
-        <w:color w:val="5C6672"/>
-        <w:sz w:val="17"/>
-      </w:rPr>
-      <w:t>Client Handover Manual</w:t>
-    </w:r>
-  </w:p>
-</w:hdr>
-</file>
-
-<file path=word/header5.xml><?xml version="1.0" encoding="utf-8"?>
-<w:hdr xmlns:m="http://schemas.openxmlformats.org/officeDocument/2006/math" xmlns:mc="http://schemas.openxmlformats.org/markup-compatibility/2006" xmlns:mo="http://schemas.microsoft.com/office/mac/office/2008/main" xmlns:mv="urn:schemas-microsoft-com:mac:vml" xmlns:o="urn:schemas-microsoft-com:office:office" xmlns:r="http://schemas.openxmlformats.org/officeDocument/2006/relationships" xmlns:v="urn:schemas-microsoft-com:vml" xmlns:w10="urn:schemas-microsoft-com:office:word" xmlns:w14="http://schemas.microsoft.com/office/word/2010/wordml" xmlns:w="http://schemas.openxmlformats.org/wordprocessingml/2006/main" xmlns:wne="http://schemas.microsoft.com/office/word/2006/wordml" xmlns:wp14="http://schemas.microsoft.com/office/word/2010/wordprocessingDrawing" xmlns:wp="http://schemas.openxmlformats.org/drawingml/2006/wordprocessingDrawing" xmlns:wpc="http://schemas.microsoft.com/office/word/2010/wordprocessingCanvas" xmlns:wpg="http://schemas.microsoft.com/office/word/2010/wordprocessingGroup" xmlns:wpi="http://schemas.microsoft.com/office/word/2010/wordprocessingInk" xmlns:wps="http://schemas.microsoft.com/office/word/2010/wordprocessingShape" mc:Ignorable="w14 wp14">
-  <w:p>
-    <w:pPr>
-      <w:pBdr>
-        <w:top w:val="nil"/>
-        <w:bottom w:val="nil"/>
-      </w:pBdr>
-      <w:spacing w:after="0" w:before="0"/>
-    </w:pPr>
-  </w:p>
-</w:hdr>
-</file>
-
-<file path=word/header6.xml><?xml version="1.0" encoding="utf-8"?>
-<w:hdr xmlns:m="http://schemas.openxmlformats.org/officeDocument/2006/math" xmlns:mc="http://schemas.openxmlformats.org/markup-compatibility/2006" xmlns:mo="http://schemas.microsoft.com/office/mac/office/2008/main" xmlns:mv="urn:schemas-microsoft-com:mac:vml" xmlns:o="urn:schemas-microsoft-com:office:office" xmlns:r="http://schemas.openxmlformats.org/officeDocument/2006/relationships" xmlns:v="urn:schemas-microsoft-com:vml" xmlns:w10="urn:schemas-microsoft-com:office:word" xmlns:w14="http://schemas.microsoft.com/office/word/2010/wordml" xmlns:w="http://schemas.openxmlformats.org/wordprocessingml/2006/main" xmlns:wne="http://schemas.microsoft.com/office/word/2006/wordml" xmlns:wp14="http://schemas.microsoft.com/office/word/2010/wordprocessingDrawing" xmlns:wp="http://schemas.openxmlformats.org/drawingml/2006/wordprocessingDrawing" xmlns:wpc="http://schemas.microsoft.com/office/word/2010/wordprocessingCanvas" xmlns:wpg="http://schemas.microsoft.com/office/word/2010/wordprocessingGroup" xmlns:wpi="http://schemas.microsoft.com/office/word/2010/wordprocessingInk" xmlns:wps="http://schemas.microsoft.com/office/word/2010/wordprocessingShape" mc:Ignorable="w14 wp14">
-  <w:p>
-    <w:pPr>
-      <w:pBdr>
-        <w:top w:val="nil"/>
-        <w:bottom w:val="nil"/>
-      </w:pBdr>
-      <w:spacing w:after="0" w:before="0"/>
-    </w:pPr>
-  </w:p>
-</w:hdr>
-</file>
-
-<file path=word/header7.xml><?xml version="1.0" encoding="utf-8"?>
 <w:hdr xmlns:m="http://schemas.openxmlformats.org/officeDocument/2006/math" xmlns:mc="http://schemas.openxmlformats.org/markup-compatibility/2006" xmlns:mo="http://schemas.microsoft.com/office/mac/office/2008/main" xmlns:mv="urn:schemas-microsoft-com:mac:vml" xmlns:o="urn:schemas-microsoft-com:office:office" xmlns:r="http://schemas.openxmlformats.org/officeDocument/2006/relationships" xmlns:v="urn:schemas-microsoft-com:vml" xmlns:w10="urn:schemas-microsoft-com:office:word" xmlns:w14="http://schemas.microsoft.com/office/word/2010/wordml" xmlns:w="http://schemas.openxmlformats.org/wordprocessingml/2006/main" xmlns:wne="http://schemas.microsoft.com/office/word/2006/wordml" xmlns:wp14="http://schemas.microsoft.com/office/word/2010/wordprocessingDrawing" xmlns:wp="http://schemas.openxmlformats.org/drawingml/2006/wordprocessingDrawing" xmlns:wpc="http://schemas.microsoft.com/office/word/2010/wordprocessingCanvas" xmlns:wpg="http://schemas.microsoft.com/office/word/2010/wordprocessingGroup" xmlns:wpi="http://schemas.microsoft.com/office/word/2010/wordprocessingInk" xmlns:wps="http://schemas.microsoft.com/office/word/2010/wordprocessingShape" mc:Ignorable="w14 wp14">
   <w:p>
     <w:pPr>
@@ -6349,20 +5812,6 @@
       </w:rPr>
       <w:t xml:space="preserve">Part II  ·  Administrator &amp; Operations Manual</w:t>
     </w:r>
-  </w:p>
-</w:hdr>
-</file>
-
-<file path=word/header9.xml><?xml version="1.0" encoding="utf-8"?>
-<w:hdr xmlns:m="http://schemas.openxmlformats.org/officeDocument/2006/math" xmlns:mc="http://schemas.openxmlformats.org/markup-compatibility/2006" xmlns:mo="http://schemas.microsoft.com/office/mac/office/2008/main" xmlns:mv="urn:schemas-microsoft-com:mac:vml" xmlns:o="urn:schemas-microsoft-com:office:office" xmlns:r="http://schemas.openxmlformats.org/officeDocument/2006/relationships" xmlns:v="urn:schemas-microsoft-com:vml" xmlns:w10="urn:schemas-microsoft-com:office:word" xmlns:w14="http://schemas.microsoft.com/office/word/2010/wordml" xmlns:w="http://schemas.openxmlformats.org/wordprocessingml/2006/main" xmlns:wne="http://schemas.microsoft.com/office/word/2006/wordml" xmlns:wp14="http://schemas.microsoft.com/office/word/2010/wordprocessingDrawing" xmlns:wp="http://schemas.openxmlformats.org/drawingml/2006/wordprocessingDrawing" xmlns:wpc="http://schemas.microsoft.com/office/word/2010/wordprocessingCanvas" xmlns:wpg="http://schemas.microsoft.com/office/word/2010/wordprocessingGroup" xmlns:wpi="http://schemas.microsoft.com/office/word/2010/wordprocessingInk" xmlns:wps="http://schemas.microsoft.com/office/word/2010/wordprocessingShape" mc:Ignorable="w14 wp14">
-  <w:p>
-    <w:pPr>
-      <w:pBdr>
-        <w:top w:val="nil"/>
-        <w:bottom w:val="nil"/>
-      </w:pBdr>
-      <w:spacing w:after="0" w:before="0"/>
-    </w:pPr>
   </w:p>
 </w:hdr>
 </file>

</xml_diff>

<commit_message>
Add QR code generation script and output image
- Created a new Python script `bel-qr.py` that generates a QR code linking to "https://tekmonks.com/r/bel-reflection".
- The script uses the `qrcode` library with specified error correction, box size, and border settings.
- Added the generated QR code image as `qr.png`.
</commit_message>
<xml_diff>
--- a/Reflection - Administrator and Operations Manual v1.0.docx
+++ b/Reflection - Administrator and Operations Manual v1.0.docx
@@ -2563,7 +2563,7 @@
         <w:br/>
       </w:r>
       <w:r>
-        <w:t xml:space="preserve">  "firewall_geo_server": "www.geoplugin.net",</w:t>
+        <w:t xml:space="preserve">  "firewall_geo_server": "",</w:t>
       </w:r>
       <w:r>
         <w:br/>
@@ -2636,6 +2636,9 @@
       <w:r>
         <w:t xml:space="preserve"> — hostname used to look up public client IP locations. The current implementation calls it over HTTP on port 80.</w:t>
       </w:r>
+      <w:r>
+        <w:t xml:space="preserve"> This deployment has no internet access, so the value is left blank here; provide a reachable geolocation server's hostname only if geolocation lookups become needed.</w:t>
+      </w:r>
     </w:p>
     <w:p>
       <w:pPr>
@@ -2693,7 +2696,7 @@
         <w:br/>
       </w:r>
       <w:r>
-        <w:t xml:space="preserve">  "firewall_geo_server": "www.geoplugin.net"</w:t>
+        <w:t xml:space="preserve">  "firewall_geo_server": ""</w:t>
       </w:r>
       <w:r>
         <w:br/>

</xml_diff>